<commit_message>
CFA + AD + Ajuste
</commit_message>
<xml_diff>
--- a/fuentes/CF3_631101_AD.docx
+++ b/fuentes/CF3_631101_AD.docx
@@ -716,23 +716,33 @@
           </w:tcPr>
           <w:p>
             <w:pPr>
+              <w:pStyle w:val="Normal"/>
               <w:spacing w:line="276" w:lineRule="auto"/>
               <w:cnfStyle w:val="000000000000" w:firstRow="0" w:lastRow="0" w:firstColumn="0" w:lastColumn="0" w:oddVBand="0" w:evenVBand="0" w:oddHBand="0" w:evenHBand="0" w:firstRowFirstColumn="0" w:firstRowLastColumn="0" w:lastRowFirstColumn="0" w:lastRowLastColumn="0"/>
               <w:rPr>
                 <w:rFonts w:ascii="Arial" w:hAnsi="Arial" w:eastAsia="Arial" w:cs="Arial"/>
-                <w:color w:val="auto"/>
-                <w:sz w:val="20"/>
-                <w:szCs w:val="20"/>
-              </w:rPr>
-            </w:pPr>
-            <w:r>
-              <w:rPr>
-                <w:rFonts w:ascii="Arial" w:hAnsi="Arial" w:eastAsia="Arial" w:cs="Arial"/>
-                <w:color w:val="auto"/>
-                <w:sz w:val="20"/>
-                <w:szCs w:val="20"/>
-              </w:rPr>
-              <w:t>Evaluar la capacidad para organizar, analizar y utilizar adecuadamente la información en el desarrollo de actividades comerciales.</w:t>
+                <w:noProof w:val="0"/>
+                <w:sz w:val="20"/>
+                <w:szCs w:val="20"/>
+                <w:lang w:val="es-419"/>
+              </w:rPr>
+            </w:pPr>
+            <w:r>
+              <w:rPr>
+                <w:rFonts w:ascii="Arial" w:hAnsi="Arial" w:eastAsia="Arial" w:cs="Arial"/>
+                <w:b w:val="0"/>
+                <w:bCs w:val="0"/>
+                <w:i w:val="0"/>
+                <w:iCs w:val="0"/>
+                <w:caps w:val="0"/>
+                <w:smallCaps w:val="0"/>
+                <w:noProof w:val="0"/>
+                <w:color w:val="12263F"/>
+                <w:sz w:val="20"/>
+                <w:szCs w:val="20"/>
+                <w:lang w:val="es-419"/>
+              </w:rPr>
+              <w:t>Con esta actividad, los aprendices podrán darse cuenta de su conocimiento en cuanto al manejo de la información y sus tipos de análisis con el fin de minimizar la incertidumbre y el riesgo en el mercado.</w:t>
             </w:r>
           </w:p>
         </w:tc>

</xml_diff>